<commit_message>
chore: update self-report Vanderbilt form document (final revision)
Replaces vanderbilt_self_form.docx/pdf with the latest version (same
18 questions, re-paginated across 3 pages). Digital questionnaire
already matches this content exactly, no code changes needed.
</commit_message>
<xml_diff>
--- a/client/public/docs/vanderbilt_self_form.docx
+++ b/client/public/docs/vanderbilt_self_form.docx
@@ -819,16 +819,16 @@
       </w:tblPr>
       <w:tblGrid>
         <w:gridCol w:w="450"/>
-        <w:gridCol w:w="5595"/>
-        <w:gridCol w:w="555"/>
+        <w:gridCol w:w="5460"/>
+        <w:gridCol w:w="690"/>
         <w:gridCol w:w="810"/>
         <w:gridCol w:w="810"/>
         <w:gridCol w:w="795"/>
         <w:tblGridChange w:id="0">
           <w:tblGrid>
             <w:gridCol w:w="450"/>
-            <w:gridCol w:w="5595"/>
-            <w:gridCol w:w="555"/>
+            <w:gridCol w:w="5460"/>
+            <w:gridCol w:w="690"/>
             <w:gridCol w:w="810"/>
             <w:gridCol w:w="810"/>
             <w:gridCol w:w="795"/>
@@ -1258,7 +1258,7 @@
       <w:tr>
         <w:trPr>
           <w:cantSplit w:val="1"/>
-          <w:trHeight w:val="591.3974062064667" w:hRule="atLeast"/>
+          <w:trHeight w:val="715.95703125" w:hRule="atLeast"/>
           <w:tblHeader w:val="0"/>
         </w:trPr>
         <w:tc>
@@ -1563,7 +1563,7 @@
       <w:tr>
         <w:trPr>
           <w:cantSplit w:val="1"/>
-          <w:trHeight w:val="487.27458402246674" w:hRule="atLeast"/>
+          <w:trHeight w:val="715.95703125" w:hRule="atLeast"/>
           <w:tblHeader w:val="0"/>
         </w:trPr>
         <w:tc>
@@ -1831,7 +1831,7 @@
       <w:tr>
         <w:trPr>
           <w:cantSplit w:val="1"/>
-          <w:trHeight w:val="487.27458402246674" w:hRule="atLeast"/>
+          <w:trHeight w:val="715.95703125" w:hRule="atLeast"/>
           <w:tblHeader w:val="0"/>
         </w:trPr>
         <w:tc>
@@ -2063,7 +2063,7 @@
       <w:tr>
         <w:trPr>
           <w:cantSplit w:val="1"/>
-          <w:trHeight w:val="591.3974062064667" w:hRule="atLeast"/>
+          <w:trHeight w:val="715.95703125" w:hRule="atLeast"/>
           <w:tblHeader w:val="0"/>
         </w:trPr>
         <w:tc>
@@ -2193,7 +2193,25 @@
               <w:rPr>
                 <w:rtl w:val="1"/>
               </w:rPr>
-              <w:t xml:space="preserve"> (</w:t>
+              <w:t xml:space="preserve"> </w:t>
+            </w:r>
+          </w:p>
+          <w:p>
+            <w:pPr>
+              <w:bidi w:val="1"/>
+              <w:spacing w:line="240" w:lineRule="auto"/>
+              <w:rPr/>
+            </w:pPr>
+            <w:r>
+              <w:rPr>
+                <w:rtl w:val="0"/>
+              </w:rPr>
+            </w:r>
+            <w:r>
+              <w:rPr>
+                <w:rtl w:val="1"/>
+              </w:rPr>
+              <w:t xml:space="preserve">(</w:t>
             </w:r>
             <w:r>
               <w:rPr>
@@ -2373,7 +2391,7 @@
       <w:tr>
         <w:trPr>
           <w:cantSplit w:val="1"/>
-          <w:trHeight w:val="487.27458402246674" w:hRule="atLeast"/>
+          <w:trHeight w:val="715.95703125" w:hRule="atLeast"/>
           <w:tblHeader w:val="0"/>
         </w:trPr>
         <w:tc>
@@ -2617,7 +2635,7 @@
       <w:tr>
         <w:trPr>
           <w:cantSplit w:val="1"/>
-          <w:trHeight w:val="591.3974062064667" w:hRule="atLeast"/>
+          <w:trHeight w:val="715.95703125" w:hRule="atLeast"/>
           <w:tblHeader w:val="0"/>
         </w:trPr>
         <w:tc>
@@ -2945,7 +2963,7 @@
       <w:tr>
         <w:trPr>
           <w:cantSplit w:val="1"/>
-          <w:trHeight w:val="591.3974062064667" w:hRule="atLeast"/>
+          <w:trHeight w:val="715.95703125" w:hRule="atLeast"/>
           <w:tblHeader w:val="0"/>
         </w:trPr>
         <w:tc>
@@ -3165,7 +3183,7 @@
       <w:tr>
         <w:trPr>
           <w:cantSplit w:val="1"/>
-          <w:trHeight w:val="487.27458402246674" w:hRule="atLeast"/>
+          <w:trHeight w:val="715.95703125" w:hRule="atLeast"/>
           <w:tblHeader w:val="0"/>
         </w:trPr>
         <w:tc>
@@ -3469,7 +3487,7 @@
       <w:tr>
         <w:trPr>
           <w:cantSplit w:val="1"/>
-          <w:trHeight w:val="487.27458402246674" w:hRule="atLeast"/>
+          <w:trHeight w:val="715.95703125" w:hRule="atLeast"/>
           <w:tblHeader w:val="0"/>
         </w:trPr>
         <w:tc>
@@ -3689,7 +3707,7 @@
       <w:tr>
         <w:trPr>
           <w:cantSplit w:val="1"/>
-          <w:trHeight w:val="487.27458402246674" w:hRule="atLeast"/>
+          <w:trHeight w:val="715.95703125" w:hRule="atLeast"/>
           <w:tblHeader w:val="0"/>
         </w:trPr>
         <w:tc>
@@ -3957,7 +3975,7 @@
       <w:tr>
         <w:trPr>
           <w:cantSplit w:val="1"/>
-          <w:trHeight w:val="591.3974062064667" w:hRule="atLeast"/>
+          <w:trHeight w:val="715.95703125" w:hRule="atLeast"/>
           <w:tblHeader w:val="0"/>
         </w:trPr>
         <w:tc>
@@ -4285,7 +4303,7 @@
       <w:tr>
         <w:trPr>
           <w:cantSplit w:val="1"/>
-          <w:trHeight w:val="487.27458402246674" w:hRule="atLeast"/>
+          <w:trHeight w:val="715.95703125" w:hRule="atLeast"/>
           <w:tblHeader w:val="0"/>
         </w:trPr>
         <w:tc>
@@ -4601,7 +4619,7 @@
       <w:tr>
         <w:trPr>
           <w:cantSplit w:val="1"/>
-          <w:trHeight w:val="591.3974062064667" w:hRule="atLeast"/>
+          <w:trHeight w:val="715.95703125" w:hRule="atLeast"/>
           <w:tblHeader w:val="0"/>
         </w:trPr>
         <w:tc>
@@ -4869,7 +4887,7 @@
       <w:tr>
         <w:trPr>
           <w:cantSplit w:val="1"/>
-          <w:trHeight w:val="591.3974062064667" w:hRule="atLeast"/>
+          <w:trHeight w:val="715.95703125" w:hRule="atLeast"/>
           <w:tblHeader w:val="0"/>
         </w:trPr>
         <w:tc>
@@ -5167,7 +5185,7 @@
       <w:tr>
         <w:trPr>
           <w:cantSplit w:val="1"/>
-          <w:trHeight w:val="487.27458402246674" w:hRule="atLeast"/>
+          <w:trHeight w:val="715.95703125" w:hRule="atLeast"/>
           <w:tblHeader w:val="0"/>
         </w:trPr>
         <w:tc>
@@ -5387,7 +5405,7 @@
       <w:tr>
         <w:trPr>
           <w:cantSplit w:val="1"/>
-          <w:trHeight w:val="487.27458402246674" w:hRule="atLeast"/>
+          <w:trHeight w:val="715.95703125" w:hRule="atLeast"/>
           <w:tblHeader w:val="0"/>
         </w:trPr>
         <w:tc>
@@ -5704,7 +5722,7 @@
       <w:tr>
         <w:trPr>
           <w:cantSplit w:val="1"/>
-          <w:trHeight w:val="487.27458402246674" w:hRule="atLeast"/>
+          <w:trHeight w:val="715.95703125" w:hRule="atLeast"/>
           <w:tblHeader w:val="0"/>
         </w:trPr>
         <w:tc>
@@ -5924,7 +5942,7 @@
       <w:tr>
         <w:trPr>
           <w:cantSplit w:val="1"/>
-          <w:trHeight w:val="487.27458402246674" w:hRule="atLeast"/>
+          <w:trHeight w:val="715.95703125" w:hRule="atLeast"/>
           <w:tblHeader w:val="0"/>
         </w:trPr>
         <w:tc>
@@ -6655,7 +6673,7 @@
         <w:szCs w:val="24"/>
         <w:rtl w:val="1"/>
       </w:rPr>
-      <w:t xml:space="preserve"> 2</w:t>
+      <w:t xml:space="preserve"> 3</w:t>
     </w:r>
   </w:p>
 </w:ftr>

</xml_diff>